<commit_message>
Vault backup (7/8): pending CMP, Leadership-Status, PI-3 & CO5 work + .gitignore
- .gitignore: ignore Office ~$ lock files and __pycache__/
- Config-Mgmt-Plan: Stage1 updates + new reusable CMP template (build script, md, docx)
- Leadership-Status: 7/1 and 7/8 status decks (md + pptx), build script, status_history
- co5-deliverable-tracking: latest updates
- PI-3/pi3-objectives; PI-2/CO5-2.4-Deliverable-Alignment.xlsx
- .claude/settings.local.json

Co-Authored-By: Claude Opus 4.8 <noreply@anthropic.com>
</commit_message>
<xml_diff>
--- a/Workspaces/Work/Projects/PPL CMDB-CSDM/Config-Mgmt-Plan/Configuration-Management-Plan-Stage1.docx
+++ b/Workspaces/Work/Projects/PPL CMDB-CSDM/Config-Mgmt-Plan/Configuration-Management-Plan-Stage1.docx
@@ -3502,7 +3502,7 @@
                 <w:b w:val="0"/>
                 <w:sz w:val="18"/>
               </w:rPr>
-              <w:t>Manage Technical Services</w:t>
+              <w:t>Service Delivery</w:t>
             </w:r>
           </w:p>
         </w:tc>
@@ -5121,7 +5121,7 @@
                 <w:b w:val="0"/>
                 <w:sz w:val="18"/>
               </w:rPr>
-              <w:t>Manage Technical Services</w:t>
+              <w:t>Service Delivery</w:t>
             </w:r>
           </w:p>
         </w:tc>
@@ -7175,7 +7175,7 @@
                 <w:b w:val="0"/>
                 <w:sz w:val="18"/>
               </w:rPr>
-              <w:t>Manage Technical Services (inherited from Server)</w:t>
+              <w:t>Service Delivery (inherited from Server)</w:t>
             </w:r>
           </w:p>
         </w:tc>
@@ -8837,7 +8837,7 @@
                 <w:b w:val="0"/>
                 <w:sz w:val="18"/>
               </w:rPr>
-              <w:t>Manage Technical Services (inherited from Server)</w:t>
+              <w:t>Service Delivery (inherited from Server)</w:t>
             </w:r>
           </w:p>
         </w:tc>
@@ -10291,7 +10291,7 @@
                 <w:b w:val="0"/>
                 <w:sz w:val="18"/>
               </w:rPr>
-              <w:t>Manage Technical Services</w:t>
+              <w:t>Service Delivery</w:t>
             </w:r>
           </w:p>
         </w:tc>
@@ -11745,7 +11745,7 @@
                 <w:b w:val="0"/>
                 <w:sz w:val="18"/>
               </w:rPr>
-              <w:t>Manage Technical Services (inherited from Database)</w:t>
+              <w:t>Service Delivery (inherited from Database)</w:t>
             </w:r>
           </w:p>
         </w:tc>
@@ -13207,7 +13207,7 @@
                 <w:b w:val="0"/>
                 <w:sz w:val="18"/>
               </w:rPr>
-              <w:t>Manage Technical Services (inherited from Database)</w:t>
+              <w:t>Service Delivery (inherited from Database)</w:t>
             </w:r>
           </w:p>
         </w:tc>

</xml_diff>